<commit_message>
Fix 16 template tag issues and add summary admin lifecycle sections
Template audit fixed missing tags across 16 templates: signing_year blanks,
death date/year fields, will/witness tags, petitioner relationship subfields,
judge_name standardization, PR entitlement reason, court address/county,
and estate value. All 36 probate templates now pass audit.

Summary admin lifecycle sections added to matter view — formSections now
picks formal vs summary forms based on wizardSelections.adminType.

Co-Authored-By: Claude Opus 4.6 (1M context) <noreply@anthropic.com>
</commit_message>
<xml_diff>
--- a/templates/P2-0205.docx
+++ b/templates/P2-0205.docx
@@ -483,6 +483,8 @@
         </w:rPr>
         <w:t>, {#petitioners}{pet_name}, {pet_address}</w:t>
         <w:br/>
+        <w:t>{pet_relationship}</w:t>
+        <w:br/>
         <w:t>{/petitioners},</w:t>
       </w:r>
       <w:r>
@@ -2961,7 +2963,7 @@
           <w:sz w:val="20"/>
           <w:szCs w:val="20"/>
         </w:rPr>
-        <w:t>this {signing_day} day of {signing_month}, ________.</w:t>
+        <w:t>this {signing_day} day of {signing_month}, {signing_year}.</w:t>
       </w:r>
     </w:p>
     <w:p>

</xml_diff>